<commit_message>
Add Health Check column to template, hide legend_label_column, bump to 0.0.4
- Add Health Check column to turtle events by location table in docx template
- Set legend_label_column: null in nesting_layer partial to hide from UI
- Bump ext-curacao requirement to 0.0.4.*
- Recompile workflow
</commit_message>
<xml_diff>
--- a/resources/templates/turtle_monitoring_template.docx
+++ b/resources/templates/turtle_monitoring_template.docx
@@ -1864,6 +1864,26 @@
                 <w:color w:val="000000"/>
                 <w:sz w:val="24"/>
               </w:rPr>
+              <w:t>Health Check</w:t>
+            </w:r>
+          </w:p>
+        </w:tc>
+        <w:tc>
+          <w:tcPr>
+            <w:tcW w:w="1821" w:type="dxa"/>
+          </w:tcPr>
+          <w:p>
+            <w:pPr>
+              <w:spacing w:before="120" w:after="120"/>
+              <w:jc w:val="center"/>
+            </w:pPr>
+            <w:r>
+              <w:rPr>
+                <w:rFonts w:ascii="Arial" w:hAnsi="Arial"/>
+                <w:b/>
+                <w:color w:val="000000"/>
+                <w:sz w:val="24"/>
+              </w:rPr>
               <w:t>Total</w:t>
             </w:r>
           </w:p>
@@ -2050,6 +2070,24 @@
                 <w:sz w:val="24"/>
               </w:rPr>
               <w:t>{{ row.Release }}</w:t>
+            </w:r>
+          </w:p>
+        </w:tc>
+        <w:tc>
+          <w:tcPr>
+            <w:tcW w:w="1821" w:type="dxa"/>
+          </w:tcPr>
+          <w:p>
+            <w:pPr>
+              <w:spacing w:before="120" w:after="120"/>
+            </w:pPr>
+            <w:r>
+              <w:rPr>
+                <w:rFonts w:ascii="Arial" w:hAnsi="Arial"/>
+                <w:color w:val="000000"/>
+                <w:sz w:val="24"/>
+              </w:rPr>
+              <w:t>{{ row.Health_Check }}</w:t>
             </w:r>
           </w:p>
         </w:tc>

</xml_diff>